<commit_message>
feat: add video wall feature and endpoint metrics scripts and dags
</commit_message>
<xml_diff>
--- a/TMPL_RP.docx
+++ b/TMPL_RP.docx
@@ -53,8 +53,6 @@
                 <w14:ligatures w14:val="standardContextual"/>
               </w:rPr>
             </w:pPr>
-            <w:bookmarkStart w:id="0" w:name="_GoBack"/>
-            <w:bookmarkEnd w:id="0"/>
             <w:r>
               <w:rPr>
                 <w:b/>
@@ -2345,6 +2343,17 @@
             </w:pPr>
             <w:r>
               <w:rPr>
+                <w:rFonts w:hint="default"/>
+                <w:b/>
+                <w:bCs/>
+                <w:sz w:val="21"/>
+                <w:szCs w:val="21"/>
+                <w:lang w:val="vi-VN"/>
+              </w:rPr>
+              <w:t xml:space="preserve">{{ </w:t>
+            </w:r>
+            <w:r>
+              <w:rPr>
                 <w:b/>
                 <w:bCs/>
                 <w:sz w:val="21"/>
@@ -2353,6 +2362,19 @@
               </w:rPr>
               <w:t>4. Thống kê Downtime</w:t>
             </w:r>
+            <w:r>
+              <w:rPr>
+                <w:rFonts w:hint="default"/>
+                <w:b/>
+                <w:bCs/>
+                <w:sz w:val="21"/>
+                <w:szCs w:val="21"/>
+                <w:lang w:val="vi-VN"/>
+              </w:rPr>
+              <w:t xml:space="preserve"> }}</w:t>
+            </w:r>
+            <w:bookmarkStart w:id="0" w:name="_GoBack"/>
+            <w:bookmarkEnd w:id="0"/>
           </w:p>
         </w:tc>
       </w:tr>

</xml_diff>